<commit_message>
Residual updates after 24/25, part 2
Various minor updates
</commit_message>
<xml_diff>
--- a/Chap/Prog01/Prog01.docx
+++ b/Chap/Prog01/Prog01.docx
@@ -1,6 +1,6 @@
 
 <file path=word/document.xml><?xml version="1.0" encoding="utf-8"?>
-<w:document xmlns:wpc="http://schemas.microsoft.com/office/word/2010/wordprocessingCanvas" xmlns:cx="http://schemas.microsoft.com/office/drawing/2014/chartex" xmlns:cx1="http://schemas.microsoft.com/office/drawing/2015/9/8/chartex" xmlns:cx2="http://schemas.microsoft.com/office/drawing/2015/10/21/chartex" xmlns:cx3="http://schemas.microsoft.com/office/drawing/2016/5/9/chartex" xmlns:cx4="http://schemas.microsoft.com/office/drawing/2016/5/10/chartex" xmlns:cx5="http://schemas.microsoft.com/office/drawing/2016/5/11/chartex" xmlns:cx6="http://schemas.microsoft.com/office/drawing/2016/5/12/chartex" xmlns:cx7="http://schemas.microsoft.com/office/drawing/2016/5/13/chartex" xmlns:cx8="http://schemas.microsoft.com/office/drawing/2016/5/14/chartex" xmlns:mc="http://schemas.openxmlformats.org/markup-compatibility/2006" xmlns:aink="http://schemas.microsoft.com/office/drawing/2016/ink" xmlns:am3d="http://schemas.microsoft.com/office/drawing/2017/model3d" xmlns:o="urn:schemas-microsoft-com:office:office" xmlns:oel="http://schemas.microsoft.com/office/2019/extlst" xmlns:r="http://schemas.openxmlformats.org/officeDocument/2006/relationships" xmlns:m="http://schemas.openxmlformats.org/officeDocument/2006/math" xmlns:v="urn:schemas-microsoft-com:vml" xmlns:wp14="http://schemas.microsoft.com/office/word/2010/wordprocessingDrawing" xmlns:wp="http://schemas.openxmlformats.org/drawingml/2006/wordprocessingDrawing" xmlns:w10="urn:schemas-microsoft-com:office:word" xmlns:w="http://schemas.openxmlformats.org/wordprocessingml/2006/main" xmlns:w14="http://schemas.microsoft.com/office/word/2010/wordml" xmlns:w15="http://schemas.microsoft.com/office/word/2012/wordml" xmlns:w16cex="http://schemas.microsoft.com/office/word/2018/wordml/cex" xmlns:w16cid="http://schemas.microsoft.com/office/word/2016/wordml/cid" xmlns:w16="http://schemas.microsoft.com/office/word/2018/wordml" xmlns:w16du="http://schemas.microsoft.com/office/word/2023/wordml/word16du" xmlns:w16sdtdh="http://schemas.microsoft.com/office/word/2020/wordml/sdtdatahash" xmlns:w16se="http://schemas.microsoft.com/office/word/2015/wordml/symex" xmlns:wpg="http://schemas.microsoft.com/office/word/2010/wordprocessingGroup" xmlns:wpi="http://schemas.microsoft.com/office/word/2010/wordprocessingInk" xmlns:wne="http://schemas.microsoft.com/office/word/2006/wordml" xmlns:wps="http://schemas.microsoft.com/office/word/2010/wordprocessingShape" mc:Ignorable="w14 w15 w16se w16cid w16 w16cex w16sdtdh w16du wp14">
+<w:document xmlns:wpc="http://schemas.microsoft.com/office/word/2010/wordprocessingCanvas" xmlns:cx="http://schemas.microsoft.com/office/drawing/2014/chartex" xmlns:cx1="http://schemas.microsoft.com/office/drawing/2015/9/8/chartex" xmlns:cx2="http://schemas.microsoft.com/office/drawing/2015/10/21/chartex" xmlns:cx3="http://schemas.microsoft.com/office/drawing/2016/5/9/chartex" xmlns:cx4="http://schemas.microsoft.com/office/drawing/2016/5/10/chartex" xmlns:cx5="http://schemas.microsoft.com/office/drawing/2016/5/11/chartex" xmlns:cx6="http://schemas.microsoft.com/office/drawing/2016/5/12/chartex" xmlns:cx7="http://schemas.microsoft.com/office/drawing/2016/5/13/chartex" xmlns:cx8="http://schemas.microsoft.com/office/drawing/2016/5/14/chartex" xmlns:mc="http://schemas.openxmlformats.org/markup-compatibility/2006" xmlns:aink="http://schemas.microsoft.com/office/drawing/2016/ink" xmlns:am3d="http://schemas.microsoft.com/office/drawing/2017/model3d" xmlns:o="urn:schemas-microsoft-com:office:office" xmlns:r="http://schemas.openxmlformats.org/officeDocument/2006/relationships" xmlns:m="http://schemas.openxmlformats.org/officeDocument/2006/math" xmlns:v="urn:schemas-microsoft-com:vml" xmlns:wp14="http://schemas.microsoft.com/office/word/2010/wordprocessingDrawing" xmlns:wp="http://schemas.openxmlformats.org/drawingml/2006/wordprocessingDrawing" xmlns:w10="urn:schemas-microsoft-com:office:word" xmlns:w="http://schemas.openxmlformats.org/wordprocessingml/2006/main" xmlns:w14="http://schemas.microsoft.com/office/word/2010/wordml" xmlns:w15="http://schemas.microsoft.com/office/word/2012/wordml" xmlns:w16cid="http://schemas.microsoft.com/office/word/2016/wordml/cid" xmlns:w16se="http://schemas.microsoft.com/office/word/2015/wordml/symex" xmlns:wpg="http://schemas.microsoft.com/office/word/2010/wordprocessingGroup" xmlns:wpi="http://schemas.microsoft.com/office/word/2010/wordprocessingInk" xmlns:wne="http://schemas.microsoft.com/office/word/2006/wordml" xmlns:wps="http://schemas.microsoft.com/office/word/2010/wordprocessingShape" mc:Ignorable="w14 w15 w16se w16cid wp14">
   <w:body>
     <w:sdt>
       <w:sdtPr>
@@ -16085,7 +16085,29 @@
                 <w:szCs w:val="24"/>
                 <w:lang w:eastAsia="da-DK"/>
               </w:rPr>
-              <w:t xml:space="preserve">. See example of how tp print data on the screen using </w:t>
+              <w:t>. See example of how t</w:t>
+            </w:r>
+            <w:r>
+              <w:rPr>
+                <w:rFonts w:ascii="Calibri" w:eastAsia="Times New Roman" w:hAnsi="Calibri" w:cs="Times New Roman"/>
+                <w:color w:val="00000A"/>
+                <w:sz w:val="28"/>
+                <w:szCs w:val="24"/>
+                <w:lang w:eastAsia="da-DK"/>
+              </w:rPr>
+              <w:t>o</w:t>
+            </w:r>
+            <w:bookmarkStart w:id="24" w:name="_GoBack"/>
+            <w:bookmarkEnd w:id="24"/>
+            <w:r>
+              <w:rPr>
+                <w:rFonts w:ascii="Calibri" w:eastAsia="Times New Roman" w:hAnsi="Calibri" w:cs="Times New Roman"/>
+                <w:color w:val="00000A"/>
+                <w:sz w:val="28"/>
+                <w:szCs w:val="24"/>
+                <w:lang w:eastAsia="da-DK"/>
+              </w:rPr>
+              <w:t xml:space="preserve"> print data on the screen using </w:t>
             </w:r>
             <w:r>
               <w:rPr>
@@ -17562,16 +17584,16 @@
                 <w:lang w:eastAsia="da-DK"/>
               </w:rPr>
             </w:pPr>
-            <w:bookmarkStart w:id="24" w:name="_Toc510676362"/>
-            <w:bookmarkStart w:id="25" w:name="_Toc111979483"/>
+            <w:bookmarkStart w:id="25" w:name="_Toc510676362"/>
+            <w:bookmarkStart w:id="26" w:name="_Toc111979483"/>
             <w:r>
               <w:rPr>
                 <w:lang w:eastAsia="da-DK"/>
               </w:rPr>
               <w:t>Pro.1.3</w:t>
             </w:r>
-            <w:bookmarkEnd w:id="24"/>
             <w:bookmarkEnd w:id="25"/>
+            <w:bookmarkEnd w:id="26"/>
           </w:p>
           <w:p>
             <w:pPr>
@@ -19722,16 +19744,16 @@
                 <w:lang w:eastAsia="da-DK"/>
               </w:rPr>
             </w:pPr>
-            <w:bookmarkStart w:id="26" w:name="_Toc510676363"/>
-            <w:bookmarkStart w:id="27" w:name="_Toc111979484"/>
+            <w:bookmarkStart w:id="27" w:name="_Toc510676363"/>
+            <w:bookmarkStart w:id="28" w:name="_Toc111979484"/>
             <w:r>
               <w:rPr>
                 <w:lang w:eastAsia="da-DK"/>
               </w:rPr>
               <w:t>Pro.1.4</w:t>
             </w:r>
-            <w:bookmarkEnd w:id="26"/>
             <w:bookmarkEnd w:id="27"/>
+            <w:bookmarkEnd w:id="28"/>
           </w:p>
           <w:p>
             <w:pPr>
@@ -20699,7 +20721,7 @@
 </file>
 
 <file path=word/endnotes.xml><?xml version="1.0" encoding="utf-8"?>
-<w:endnotes xmlns:wpc="http://schemas.microsoft.com/office/word/2010/wordprocessingCanvas" xmlns:cx="http://schemas.microsoft.com/office/drawing/2014/chartex" xmlns:cx1="http://schemas.microsoft.com/office/drawing/2015/9/8/chartex" xmlns:cx2="http://schemas.microsoft.com/office/drawing/2015/10/21/chartex" xmlns:cx3="http://schemas.microsoft.com/office/drawing/2016/5/9/chartex" xmlns:cx4="http://schemas.microsoft.com/office/drawing/2016/5/10/chartex" xmlns:cx5="http://schemas.microsoft.com/office/drawing/2016/5/11/chartex" xmlns:cx6="http://schemas.microsoft.com/office/drawing/2016/5/12/chartex" xmlns:cx7="http://schemas.microsoft.com/office/drawing/2016/5/13/chartex" xmlns:cx8="http://schemas.microsoft.com/office/drawing/2016/5/14/chartex" xmlns:mc="http://schemas.openxmlformats.org/markup-compatibility/2006" xmlns:aink="http://schemas.microsoft.com/office/drawing/2016/ink" xmlns:am3d="http://schemas.microsoft.com/office/drawing/2017/model3d" xmlns:o="urn:schemas-microsoft-com:office:office" xmlns:oel="http://schemas.microsoft.com/office/2019/extlst" xmlns:r="http://schemas.openxmlformats.org/officeDocument/2006/relationships" xmlns:m="http://schemas.openxmlformats.org/officeDocument/2006/math" xmlns:v="urn:schemas-microsoft-com:vml" xmlns:wp14="http://schemas.microsoft.com/office/word/2010/wordprocessingDrawing" xmlns:wp="http://schemas.openxmlformats.org/drawingml/2006/wordprocessingDrawing" xmlns:w10="urn:schemas-microsoft-com:office:word" xmlns:w="http://schemas.openxmlformats.org/wordprocessingml/2006/main" xmlns:w14="http://schemas.microsoft.com/office/word/2010/wordml" xmlns:w15="http://schemas.microsoft.com/office/word/2012/wordml" xmlns:w16cex="http://schemas.microsoft.com/office/word/2018/wordml/cex" xmlns:w16cid="http://schemas.microsoft.com/office/word/2016/wordml/cid" xmlns:w16="http://schemas.microsoft.com/office/word/2018/wordml" xmlns:w16du="http://schemas.microsoft.com/office/word/2023/wordml/word16du" xmlns:w16sdtdh="http://schemas.microsoft.com/office/word/2020/wordml/sdtdatahash" xmlns:w16se="http://schemas.microsoft.com/office/word/2015/wordml/symex" xmlns:wpg="http://schemas.microsoft.com/office/word/2010/wordprocessingGroup" xmlns:wpi="http://schemas.microsoft.com/office/word/2010/wordprocessingInk" xmlns:wne="http://schemas.microsoft.com/office/word/2006/wordml" xmlns:wps="http://schemas.microsoft.com/office/word/2010/wordprocessingShape" mc:Ignorable="w14 w15 w16se w16cid w16 w16cex w16sdtdh w16du wp14">
+<w:endnotes xmlns:wpc="http://schemas.microsoft.com/office/word/2010/wordprocessingCanvas" xmlns:cx="http://schemas.microsoft.com/office/drawing/2014/chartex" xmlns:cx1="http://schemas.microsoft.com/office/drawing/2015/9/8/chartex" xmlns:cx2="http://schemas.microsoft.com/office/drawing/2015/10/21/chartex" xmlns:cx3="http://schemas.microsoft.com/office/drawing/2016/5/9/chartex" xmlns:cx4="http://schemas.microsoft.com/office/drawing/2016/5/10/chartex" xmlns:cx5="http://schemas.microsoft.com/office/drawing/2016/5/11/chartex" xmlns:cx6="http://schemas.microsoft.com/office/drawing/2016/5/12/chartex" xmlns:cx7="http://schemas.microsoft.com/office/drawing/2016/5/13/chartex" xmlns:cx8="http://schemas.microsoft.com/office/drawing/2016/5/14/chartex" xmlns:mc="http://schemas.openxmlformats.org/markup-compatibility/2006" xmlns:aink="http://schemas.microsoft.com/office/drawing/2016/ink" xmlns:am3d="http://schemas.microsoft.com/office/drawing/2017/model3d" xmlns:o="urn:schemas-microsoft-com:office:office" xmlns:r="http://schemas.openxmlformats.org/officeDocument/2006/relationships" xmlns:m="http://schemas.openxmlformats.org/officeDocument/2006/math" xmlns:v="urn:schemas-microsoft-com:vml" xmlns:wp14="http://schemas.microsoft.com/office/word/2010/wordprocessingDrawing" xmlns:wp="http://schemas.openxmlformats.org/drawingml/2006/wordprocessingDrawing" xmlns:w10="urn:schemas-microsoft-com:office:word" xmlns:w="http://schemas.openxmlformats.org/wordprocessingml/2006/main" xmlns:w14="http://schemas.microsoft.com/office/word/2010/wordml" xmlns:w15="http://schemas.microsoft.com/office/word/2012/wordml" xmlns:w16cid="http://schemas.microsoft.com/office/word/2016/wordml/cid" xmlns:w16se="http://schemas.microsoft.com/office/word/2015/wordml/symex" xmlns:wpg="http://schemas.microsoft.com/office/word/2010/wordprocessingGroup" xmlns:wpi="http://schemas.microsoft.com/office/word/2010/wordprocessingInk" xmlns:wne="http://schemas.microsoft.com/office/word/2006/wordml" xmlns:wps="http://schemas.microsoft.com/office/word/2010/wordprocessingShape" mc:Ignorable="w14 w15 w16se w16cid wp14">
   <w:endnote w:type="separator" w:id="-1">
     <w:p>
       <w:r>
@@ -20718,7 +20740,7 @@
 </file>
 
 <file path=word/footer1.xml><?xml version="1.0" encoding="utf-8"?>
-<w:ftr xmlns:wpc="http://schemas.microsoft.com/office/word/2010/wordprocessingCanvas" xmlns:cx="http://schemas.microsoft.com/office/drawing/2014/chartex" xmlns:cx1="http://schemas.microsoft.com/office/drawing/2015/9/8/chartex" xmlns:cx2="http://schemas.microsoft.com/office/drawing/2015/10/21/chartex" xmlns:cx3="http://schemas.microsoft.com/office/drawing/2016/5/9/chartex" xmlns:cx4="http://schemas.microsoft.com/office/drawing/2016/5/10/chartex" xmlns:cx5="http://schemas.microsoft.com/office/drawing/2016/5/11/chartex" xmlns:cx6="http://schemas.microsoft.com/office/drawing/2016/5/12/chartex" xmlns:cx7="http://schemas.microsoft.com/office/drawing/2016/5/13/chartex" xmlns:cx8="http://schemas.microsoft.com/office/drawing/2016/5/14/chartex" xmlns:mc="http://schemas.openxmlformats.org/markup-compatibility/2006" xmlns:aink="http://schemas.microsoft.com/office/drawing/2016/ink" xmlns:am3d="http://schemas.microsoft.com/office/drawing/2017/model3d" xmlns:o="urn:schemas-microsoft-com:office:office" xmlns:oel="http://schemas.microsoft.com/office/2019/extlst" xmlns:r="http://schemas.openxmlformats.org/officeDocument/2006/relationships" xmlns:m="http://schemas.openxmlformats.org/officeDocument/2006/math" xmlns:v="urn:schemas-microsoft-com:vml" xmlns:wp14="http://schemas.microsoft.com/office/word/2010/wordprocessingDrawing" xmlns:wp="http://schemas.openxmlformats.org/drawingml/2006/wordprocessingDrawing" xmlns:w10="urn:schemas-microsoft-com:office:word" xmlns:w="http://schemas.openxmlformats.org/wordprocessingml/2006/main" xmlns:w14="http://schemas.microsoft.com/office/word/2010/wordml" xmlns:w15="http://schemas.microsoft.com/office/word/2012/wordml" xmlns:w16cex="http://schemas.microsoft.com/office/word/2018/wordml/cex" xmlns:w16cid="http://schemas.microsoft.com/office/word/2016/wordml/cid" xmlns:w16="http://schemas.microsoft.com/office/word/2018/wordml" xmlns:w16du="http://schemas.microsoft.com/office/word/2023/wordml/word16du" xmlns:w16sdtdh="http://schemas.microsoft.com/office/word/2020/wordml/sdtdatahash" xmlns:w16se="http://schemas.microsoft.com/office/word/2015/wordml/symex" xmlns:wpg="http://schemas.microsoft.com/office/word/2010/wordprocessingGroup" xmlns:wpi="http://schemas.microsoft.com/office/word/2010/wordprocessingInk" xmlns:wne="http://schemas.microsoft.com/office/word/2006/wordml" xmlns:wps="http://schemas.microsoft.com/office/word/2010/wordprocessingShape" mc:Ignorable="w14 w15 w16se w16cid w16 w16cex w16sdtdh w16du wp14">
+<w:ftr xmlns:wpc="http://schemas.microsoft.com/office/word/2010/wordprocessingCanvas" xmlns:cx="http://schemas.microsoft.com/office/drawing/2014/chartex" xmlns:cx1="http://schemas.microsoft.com/office/drawing/2015/9/8/chartex" xmlns:cx2="http://schemas.microsoft.com/office/drawing/2015/10/21/chartex" xmlns:cx3="http://schemas.microsoft.com/office/drawing/2016/5/9/chartex" xmlns:cx4="http://schemas.microsoft.com/office/drawing/2016/5/10/chartex" xmlns:cx5="http://schemas.microsoft.com/office/drawing/2016/5/11/chartex" xmlns:cx6="http://schemas.microsoft.com/office/drawing/2016/5/12/chartex" xmlns:cx7="http://schemas.microsoft.com/office/drawing/2016/5/13/chartex" xmlns:cx8="http://schemas.microsoft.com/office/drawing/2016/5/14/chartex" xmlns:mc="http://schemas.openxmlformats.org/markup-compatibility/2006" xmlns:aink="http://schemas.microsoft.com/office/drawing/2016/ink" xmlns:am3d="http://schemas.microsoft.com/office/drawing/2017/model3d" xmlns:o="urn:schemas-microsoft-com:office:office" xmlns:r="http://schemas.openxmlformats.org/officeDocument/2006/relationships" xmlns:m="http://schemas.openxmlformats.org/officeDocument/2006/math" xmlns:v="urn:schemas-microsoft-com:vml" xmlns:wp14="http://schemas.microsoft.com/office/word/2010/wordprocessingDrawing" xmlns:wp="http://schemas.openxmlformats.org/drawingml/2006/wordprocessingDrawing" xmlns:w10="urn:schemas-microsoft-com:office:word" xmlns:w="http://schemas.openxmlformats.org/wordprocessingml/2006/main" xmlns:w14="http://schemas.microsoft.com/office/word/2010/wordml" xmlns:w15="http://schemas.microsoft.com/office/word/2012/wordml" xmlns:w16cid="http://schemas.microsoft.com/office/word/2016/wordml/cid" xmlns:w16se="http://schemas.microsoft.com/office/word/2015/wordml/symex" xmlns:wpg="http://schemas.microsoft.com/office/word/2010/wordprocessingGroup" xmlns:wpi="http://schemas.microsoft.com/office/word/2010/wordprocessingInk" xmlns:wne="http://schemas.microsoft.com/office/word/2006/wordml" xmlns:wps="http://schemas.microsoft.com/office/word/2010/wordprocessingShape" mc:Ignorable="w14 w15 w16se w16cid wp14">
   <w:sdt>
     <w:sdtPr>
       <w:id w:val="-645208757"/>
@@ -20764,7 +20786,7 @@
 </file>
 
 <file path=word/footnotes.xml><?xml version="1.0" encoding="utf-8"?>
-<w:footnotes xmlns:wpc="http://schemas.microsoft.com/office/word/2010/wordprocessingCanvas" xmlns:cx="http://schemas.microsoft.com/office/drawing/2014/chartex" xmlns:cx1="http://schemas.microsoft.com/office/drawing/2015/9/8/chartex" xmlns:cx2="http://schemas.microsoft.com/office/drawing/2015/10/21/chartex" xmlns:cx3="http://schemas.microsoft.com/office/drawing/2016/5/9/chartex" xmlns:cx4="http://schemas.microsoft.com/office/drawing/2016/5/10/chartex" xmlns:cx5="http://schemas.microsoft.com/office/drawing/2016/5/11/chartex" xmlns:cx6="http://schemas.microsoft.com/office/drawing/2016/5/12/chartex" xmlns:cx7="http://schemas.microsoft.com/office/drawing/2016/5/13/chartex" xmlns:cx8="http://schemas.microsoft.com/office/drawing/2016/5/14/chartex" xmlns:mc="http://schemas.openxmlformats.org/markup-compatibility/2006" xmlns:aink="http://schemas.microsoft.com/office/drawing/2016/ink" xmlns:am3d="http://schemas.microsoft.com/office/drawing/2017/model3d" xmlns:o="urn:schemas-microsoft-com:office:office" xmlns:oel="http://schemas.microsoft.com/office/2019/extlst" xmlns:r="http://schemas.openxmlformats.org/officeDocument/2006/relationships" xmlns:m="http://schemas.openxmlformats.org/officeDocument/2006/math" xmlns:v="urn:schemas-microsoft-com:vml" xmlns:wp14="http://schemas.microsoft.com/office/word/2010/wordprocessingDrawing" xmlns:wp="http://schemas.openxmlformats.org/drawingml/2006/wordprocessingDrawing" xmlns:w10="urn:schemas-microsoft-com:office:word" xmlns:w="http://schemas.openxmlformats.org/wordprocessingml/2006/main" xmlns:w14="http://schemas.microsoft.com/office/word/2010/wordml" xmlns:w15="http://schemas.microsoft.com/office/word/2012/wordml" xmlns:w16cex="http://schemas.microsoft.com/office/word/2018/wordml/cex" xmlns:w16cid="http://schemas.microsoft.com/office/word/2016/wordml/cid" xmlns:w16="http://schemas.microsoft.com/office/word/2018/wordml" xmlns:w16du="http://schemas.microsoft.com/office/word/2023/wordml/word16du" xmlns:w16sdtdh="http://schemas.microsoft.com/office/word/2020/wordml/sdtdatahash" xmlns:w16se="http://schemas.microsoft.com/office/word/2015/wordml/symex" xmlns:wpg="http://schemas.microsoft.com/office/word/2010/wordprocessingGroup" xmlns:wpi="http://schemas.microsoft.com/office/word/2010/wordprocessingInk" xmlns:wne="http://schemas.microsoft.com/office/word/2006/wordml" xmlns:wps="http://schemas.microsoft.com/office/word/2010/wordprocessingShape" mc:Ignorable="w14 w15 w16se w16cid w16 w16cex w16sdtdh w16du wp14">
+<w:footnotes xmlns:wpc="http://schemas.microsoft.com/office/word/2010/wordprocessingCanvas" xmlns:cx="http://schemas.microsoft.com/office/drawing/2014/chartex" xmlns:cx1="http://schemas.microsoft.com/office/drawing/2015/9/8/chartex" xmlns:cx2="http://schemas.microsoft.com/office/drawing/2015/10/21/chartex" xmlns:cx3="http://schemas.microsoft.com/office/drawing/2016/5/9/chartex" xmlns:cx4="http://schemas.microsoft.com/office/drawing/2016/5/10/chartex" xmlns:cx5="http://schemas.microsoft.com/office/drawing/2016/5/11/chartex" xmlns:cx6="http://schemas.microsoft.com/office/drawing/2016/5/12/chartex" xmlns:cx7="http://schemas.microsoft.com/office/drawing/2016/5/13/chartex" xmlns:cx8="http://schemas.microsoft.com/office/drawing/2016/5/14/chartex" xmlns:mc="http://schemas.openxmlformats.org/markup-compatibility/2006" xmlns:aink="http://schemas.microsoft.com/office/drawing/2016/ink" xmlns:am3d="http://schemas.microsoft.com/office/drawing/2017/model3d" xmlns:o="urn:schemas-microsoft-com:office:office" xmlns:r="http://schemas.openxmlformats.org/officeDocument/2006/relationships" xmlns:m="http://schemas.openxmlformats.org/officeDocument/2006/math" xmlns:v="urn:schemas-microsoft-com:vml" xmlns:wp14="http://schemas.microsoft.com/office/word/2010/wordprocessingDrawing" xmlns:wp="http://schemas.openxmlformats.org/drawingml/2006/wordprocessingDrawing" xmlns:w10="urn:schemas-microsoft-com:office:word" xmlns:w="http://schemas.openxmlformats.org/wordprocessingml/2006/main" xmlns:w14="http://schemas.microsoft.com/office/word/2010/wordml" xmlns:w15="http://schemas.microsoft.com/office/word/2012/wordml" xmlns:w16cid="http://schemas.microsoft.com/office/word/2016/wordml/cid" xmlns:w16se="http://schemas.microsoft.com/office/word/2015/wordml/symex" xmlns:wpg="http://schemas.microsoft.com/office/word/2010/wordprocessingGroup" xmlns:wpi="http://schemas.microsoft.com/office/word/2010/wordprocessingInk" xmlns:wne="http://schemas.microsoft.com/office/word/2006/wordml" xmlns:wps="http://schemas.microsoft.com/office/word/2010/wordprocessingShape" mc:Ignorable="w14 w15 w16se w16cid wp14">
   <w:footnote w:type="separator" w:id="-1">
     <w:p>
       <w:r>
@@ -20840,7 +20862,7 @@
 </file>
 
 <file path=word/numbering.xml><?xml version="1.0" encoding="utf-8"?>
-<w:numbering xmlns:wpc="http://schemas.microsoft.com/office/word/2010/wordprocessingCanvas" xmlns:cx="http://schemas.microsoft.com/office/drawing/2014/chartex" xmlns:cx1="http://schemas.microsoft.com/office/drawing/2015/9/8/chartex" xmlns:cx2="http://schemas.microsoft.com/office/drawing/2015/10/21/chartex" xmlns:cx3="http://schemas.microsoft.com/office/drawing/2016/5/9/chartex" xmlns:cx4="http://schemas.microsoft.com/office/drawing/2016/5/10/chartex" xmlns:cx5="http://schemas.microsoft.com/office/drawing/2016/5/11/chartex" xmlns:cx6="http://schemas.microsoft.com/office/drawing/2016/5/12/chartex" xmlns:cx7="http://schemas.microsoft.com/office/drawing/2016/5/13/chartex" xmlns:cx8="http://schemas.microsoft.com/office/drawing/2016/5/14/chartex" xmlns:mc="http://schemas.openxmlformats.org/markup-compatibility/2006" xmlns:aink="http://schemas.microsoft.com/office/drawing/2016/ink" xmlns:am3d="http://schemas.microsoft.com/office/drawing/2017/model3d" xmlns:o="urn:schemas-microsoft-com:office:office" xmlns:oel="http://schemas.microsoft.com/office/2019/extlst" xmlns:r="http://schemas.openxmlformats.org/officeDocument/2006/relationships" xmlns:m="http://schemas.openxmlformats.org/officeDocument/2006/math" xmlns:v="urn:schemas-microsoft-com:vml" xmlns:wp14="http://schemas.microsoft.com/office/word/2010/wordprocessingDrawing" xmlns:wp="http://schemas.openxmlformats.org/drawingml/2006/wordprocessingDrawing" xmlns:w10="urn:schemas-microsoft-com:office:word" xmlns:w="http://schemas.openxmlformats.org/wordprocessingml/2006/main" xmlns:w14="http://schemas.microsoft.com/office/word/2010/wordml" xmlns:w15="http://schemas.microsoft.com/office/word/2012/wordml" xmlns:w16cex="http://schemas.microsoft.com/office/word/2018/wordml/cex" xmlns:w16cid="http://schemas.microsoft.com/office/word/2016/wordml/cid" xmlns:w16="http://schemas.microsoft.com/office/word/2018/wordml" xmlns:w16du="http://schemas.microsoft.com/office/word/2023/wordml/word16du" xmlns:w16sdtdh="http://schemas.microsoft.com/office/word/2020/wordml/sdtdatahash" xmlns:w16se="http://schemas.microsoft.com/office/word/2015/wordml/symex" xmlns:wpg="http://schemas.microsoft.com/office/word/2010/wordprocessingGroup" xmlns:wpi="http://schemas.microsoft.com/office/word/2010/wordprocessingInk" xmlns:wne="http://schemas.microsoft.com/office/word/2006/wordml" xmlns:wps="http://schemas.microsoft.com/office/word/2010/wordprocessingShape" mc:Ignorable="w14 w15 w16se w16cid w16 w16cex w16sdtdh w16du wp14">
+<w:numbering xmlns:wpc="http://schemas.microsoft.com/office/word/2010/wordprocessingCanvas" xmlns:cx="http://schemas.microsoft.com/office/drawing/2014/chartex" xmlns:cx1="http://schemas.microsoft.com/office/drawing/2015/9/8/chartex" xmlns:cx2="http://schemas.microsoft.com/office/drawing/2015/10/21/chartex" xmlns:cx3="http://schemas.microsoft.com/office/drawing/2016/5/9/chartex" xmlns:cx4="http://schemas.microsoft.com/office/drawing/2016/5/10/chartex" xmlns:cx5="http://schemas.microsoft.com/office/drawing/2016/5/11/chartex" xmlns:cx6="http://schemas.microsoft.com/office/drawing/2016/5/12/chartex" xmlns:cx7="http://schemas.microsoft.com/office/drawing/2016/5/13/chartex" xmlns:cx8="http://schemas.microsoft.com/office/drawing/2016/5/14/chartex" xmlns:mc="http://schemas.openxmlformats.org/markup-compatibility/2006" xmlns:aink="http://schemas.microsoft.com/office/drawing/2016/ink" xmlns:am3d="http://schemas.microsoft.com/office/drawing/2017/model3d" xmlns:o="urn:schemas-microsoft-com:office:office" xmlns:r="http://schemas.openxmlformats.org/officeDocument/2006/relationships" xmlns:m="http://schemas.openxmlformats.org/officeDocument/2006/math" xmlns:v="urn:schemas-microsoft-com:vml" xmlns:wp14="http://schemas.microsoft.com/office/word/2010/wordprocessingDrawing" xmlns:wp="http://schemas.openxmlformats.org/drawingml/2006/wordprocessingDrawing" xmlns:w10="urn:schemas-microsoft-com:office:word" xmlns:w="http://schemas.openxmlformats.org/wordprocessingml/2006/main" xmlns:w14="http://schemas.microsoft.com/office/word/2010/wordml" xmlns:w15="http://schemas.microsoft.com/office/word/2012/wordml" xmlns:w16cid="http://schemas.microsoft.com/office/word/2016/wordml/cid" xmlns:w16se="http://schemas.microsoft.com/office/word/2015/wordml/symex" xmlns:wpg="http://schemas.microsoft.com/office/word/2010/wordprocessingGroup" xmlns:wpi="http://schemas.microsoft.com/office/word/2010/wordprocessingInk" xmlns:wne="http://schemas.microsoft.com/office/word/2006/wordml" xmlns:wps="http://schemas.microsoft.com/office/word/2010/wordprocessingShape" mc:Ignorable="w14 w15 w16se w16cid wp14">
   <w:abstractNum w:abstractNumId="0" w15:restartNumberingAfterBreak="0">
     <w:nsid w:val="021E794B"/>
     <w:multiLevelType w:val="hybridMultilevel"/>
@@ -37326,463 +37348,463 @@
       </w:rPr>
     </w:lvl>
   </w:abstractNum>
-  <w:num w:numId="1" w16cid:durableId="18240771">
+  <w:num w:numId="1">
     <w:abstractNumId w:val="66"/>
   </w:num>
-  <w:num w:numId="2" w16cid:durableId="1879269793">
+  <w:num w:numId="2">
     <w:abstractNumId w:val="73"/>
   </w:num>
-  <w:num w:numId="3" w16cid:durableId="560942903">
+  <w:num w:numId="3">
     <w:abstractNumId w:val="51"/>
   </w:num>
-  <w:num w:numId="4" w16cid:durableId="2066483019">
+  <w:num w:numId="4">
     <w:abstractNumId w:val="82"/>
   </w:num>
-  <w:num w:numId="5" w16cid:durableId="51125502">
+  <w:num w:numId="5">
     <w:abstractNumId w:val="3"/>
   </w:num>
-  <w:num w:numId="6" w16cid:durableId="382414139">
+  <w:num w:numId="6">
     <w:abstractNumId w:val="67"/>
   </w:num>
-  <w:num w:numId="7" w16cid:durableId="629750275">
+  <w:num w:numId="7">
     <w:abstractNumId w:val="151"/>
   </w:num>
-  <w:num w:numId="8" w16cid:durableId="1095202524">
+  <w:num w:numId="8">
     <w:abstractNumId w:val="77"/>
   </w:num>
-  <w:num w:numId="9" w16cid:durableId="1042168421">
+  <w:num w:numId="9">
     <w:abstractNumId w:val="150"/>
   </w:num>
-  <w:num w:numId="10" w16cid:durableId="303126608">
+  <w:num w:numId="10">
     <w:abstractNumId w:val="152"/>
   </w:num>
-  <w:num w:numId="11" w16cid:durableId="183135851">
+  <w:num w:numId="11">
     <w:abstractNumId w:val="102"/>
   </w:num>
-  <w:num w:numId="12" w16cid:durableId="524444225">
+  <w:num w:numId="12">
     <w:abstractNumId w:val="39"/>
   </w:num>
-  <w:num w:numId="13" w16cid:durableId="1887789104">
+  <w:num w:numId="13">
     <w:abstractNumId w:val="141"/>
   </w:num>
-  <w:num w:numId="14" w16cid:durableId="1740712131">
+  <w:num w:numId="14">
     <w:abstractNumId w:val="56"/>
   </w:num>
-  <w:num w:numId="15" w16cid:durableId="125203613">
+  <w:num w:numId="15">
     <w:abstractNumId w:val="78"/>
   </w:num>
-  <w:num w:numId="16" w16cid:durableId="497889547">
+  <w:num w:numId="16">
     <w:abstractNumId w:val="103"/>
   </w:num>
-  <w:num w:numId="17" w16cid:durableId="1278758754">
+  <w:num w:numId="17">
     <w:abstractNumId w:val="0"/>
   </w:num>
-  <w:num w:numId="18" w16cid:durableId="2067532822">
+  <w:num w:numId="18">
     <w:abstractNumId w:val="89"/>
   </w:num>
-  <w:num w:numId="19" w16cid:durableId="1411536879">
+  <w:num w:numId="19">
     <w:abstractNumId w:val="95"/>
   </w:num>
-  <w:num w:numId="20" w16cid:durableId="705250357">
+  <w:num w:numId="20">
     <w:abstractNumId w:val="85"/>
   </w:num>
-  <w:num w:numId="21" w16cid:durableId="1228689753">
+  <w:num w:numId="21">
     <w:abstractNumId w:val="126"/>
   </w:num>
-  <w:num w:numId="22" w16cid:durableId="38821510">
+  <w:num w:numId="22">
     <w:abstractNumId w:val="145"/>
   </w:num>
-  <w:num w:numId="23" w16cid:durableId="298338751">
+  <w:num w:numId="23">
     <w:abstractNumId w:val="15"/>
   </w:num>
-  <w:num w:numId="24" w16cid:durableId="1277054901">
+  <w:num w:numId="24">
     <w:abstractNumId w:val="12"/>
   </w:num>
-  <w:num w:numId="25" w16cid:durableId="93136491">
+  <w:num w:numId="25">
     <w:abstractNumId w:val="112"/>
   </w:num>
-  <w:num w:numId="26" w16cid:durableId="2096707084">
+  <w:num w:numId="26">
     <w:abstractNumId w:val="132"/>
   </w:num>
-  <w:num w:numId="27" w16cid:durableId="672144638">
+  <w:num w:numId="27">
     <w:abstractNumId w:val="7"/>
   </w:num>
-  <w:num w:numId="28" w16cid:durableId="108666354">
+  <w:num w:numId="28">
     <w:abstractNumId w:val="137"/>
   </w:num>
-  <w:num w:numId="29" w16cid:durableId="259922587">
+  <w:num w:numId="29">
     <w:abstractNumId w:val="24"/>
   </w:num>
-  <w:num w:numId="30" w16cid:durableId="301082064">
+  <w:num w:numId="30">
     <w:abstractNumId w:val="72"/>
   </w:num>
-  <w:num w:numId="31" w16cid:durableId="906501903">
+  <w:num w:numId="31">
     <w:abstractNumId w:val="105"/>
   </w:num>
-  <w:num w:numId="32" w16cid:durableId="395207362">
+  <w:num w:numId="32">
     <w:abstractNumId w:val="74"/>
   </w:num>
-  <w:num w:numId="33" w16cid:durableId="245190826">
+  <w:num w:numId="33">
     <w:abstractNumId w:val="1"/>
   </w:num>
-  <w:num w:numId="34" w16cid:durableId="1317412930">
+  <w:num w:numId="34">
     <w:abstractNumId w:val="147"/>
   </w:num>
-  <w:num w:numId="35" w16cid:durableId="43450899">
+  <w:num w:numId="35">
     <w:abstractNumId w:val="10"/>
   </w:num>
-  <w:num w:numId="36" w16cid:durableId="1820268262">
+  <w:num w:numId="36">
     <w:abstractNumId w:val="138"/>
   </w:num>
-  <w:num w:numId="37" w16cid:durableId="279843013">
+  <w:num w:numId="37">
     <w:abstractNumId w:val="92"/>
   </w:num>
-  <w:num w:numId="38" w16cid:durableId="848720339">
+  <w:num w:numId="38">
     <w:abstractNumId w:val="54"/>
   </w:num>
-  <w:num w:numId="39" w16cid:durableId="1212615260">
+  <w:num w:numId="39">
     <w:abstractNumId w:val="13"/>
   </w:num>
-  <w:num w:numId="40" w16cid:durableId="546916152">
+  <w:num w:numId="40">
     <w:abstractNumId w:val="22"/>
   </w:num>
-  <w:num w:numId="41" w16cid:durableId="59866719">
+  <w:num w:numId="41">
     <w:abstractNumId w:val="118"/>
   </w:num>
-  <w:num w:numId="42" w16cid:durableId="979924684">
+  <w:num w:numId="42">
     <w:abstractNumId w:val="144"/>
   </w:num>
-  <w:num w:numId="43" w16cid:durableId="293489335">
+  <w:num w:numId="43">
     <w:abstractNumId w:val="148"/>
   </w:num>
-  <w:num w:numId="44" w16cid:durableId="95029959">
+  <w:num w:numId="44">
     <w:abstractNumId w:val="136"/>
   </w:num>
-  <w:num w:numId="45" w16cid:durableId="1114447378">
+  <w:num w:numId="45">
     <w:abstractNumId w:val="143"/>
   </w:num>
-  <w:num w:numId="46" w16cid:durableId="1962610844">
+  <w:num w:numId="46">
     <w:abstractNumId w:val="83"/>
   </w:num>
-  <w:num w:numId="47" w16cid:durableId="260379803">
+  <w:num w:numId="47">
     <w:abstractNumId w:val="130"/>
   </w:num>
-  <w:num w:numId="48" w16cid:durableId="561529339">
+  <w:num w:numId="48">
     <w:abstractNumId w:val="2"/>
   </w:num>
-  <w:num w:numId="49" w16cid:durableId="146897209">
+  <w:num w:numId="49">
     <w:abstractNumId w:val="42"/>
   </w:num>
-  <w:num w:numId="50" w16cid:durableId="482165754">
+  <w:num w:numId="50">
     <w:abstractNumId w:val="121"/>
   </w:num>
-  <w:num w:numId="51" w16cid:durableId="718942928">
+  <w:num w:numId="51">
     <w:abstractNumId w:val="139"/>
   </w:num>
-  <w:num w:numId="52" w16cid:durableId="1409614758">
+  <w:num w:numId="52">
     <w:abstractNumId w:val="91"/>
   </w:num>
-  <w:num w:numId="53" w16cid:durableId="380129718">
+  <w:num w:numId="53">
     <w:abstractNumId w:val="86"/>
   </w:num>
-  <w:num w:numId="54" w16cid:durableId="10648903">
+  <w:num w:numId="54">
     <w:abstractNumId w:val="50"/>
   </w:num>
-  <w:num w:numId="55" w16cid:durableId="1040939803">
+  <w:num w:numId="55">
     <w:abstractNumId w:val="4"/>
   </w:num>
-  <w:num w:numId="56" w16cid:durableId="49694277">
+  <w:num w:numId="56">
     <w:abstractNumId w:val="55"/>
   </w:num>
-  <w:num w:numId="57" w16cid:durableId="178473286">
+  <w:num w:numId="57">
     <w:abstractNumId w:val="68"/>
   </w:num>
-  <w:num w:numId="58" w16cid:durableId="671639213">
+  <w:num w:numId="58">
     <w:abstractNumId w:val="45"/>
   </w:num>
-  <w:num w:numId="59" w16cid:durableId="924534728">
+  <w:num w:numId="59">
     <w:abstractNumId w:val="104"/>
   </w:num>
-  <w:num w:numId="60" w16cid:durableId="867764643">
+  <w:num w:numId="60">
     <w:abstractNumId w:val="125"/>
   </w:num>
-  <w:num w:numId="61" w16cid:durableId="1879777506">
+  <w:num w:numId="61">
     <w:abstractNumId w:val="60"/>
   </w:num>
-  <w:num w:numId="62" w16cid:durableId="1222519966">
+  <w:num w:numId="62">
     <w:abstractNumId w:val="115"/>
   </w:num>
-  <w:num w:numId="63" w16cid:durableId="817040208">
+  <w:num w:numId="63">
     <w:abstractNumId w:val="80"/>
   </w:num>
-  <w:num w:numId="64" w16cid:durableId="2031906132">
+  <w:num w:numId="64">
     <w:abstractNumId w:val="25"/>
   </w:num>
-  <w:num w:numId="65" w16cid:durableId="699471304">
+  <w:num w:numId="65">
     <w:abstractNumId w:val="63"/>
   </w:num>
-  <w:num w:numId="66" w16cid:durableId="1300577999">
+  <w:num w:numId="66">
     <w:abstractNumId w:val="140"/>
   </w:num>
-  <w:num w:numId="67" w16cid:durableId="1948072753">
+  <w:num w:numId="67">
     <w:abstractNumId w:val="113"/>
   </w:num>
-  <w:num w:numId="68" w16cid:durableId="1420179151">
+  <w:num w:numId="68">
     <w:abstractNumId w:val="75"/>
   </w:num>
-  <w:num w:numId="69" w16cid:durableId="575013203">
+  <w:num w:numId="69">
     <w:abstractNumId w:val="62"/>
   </w:num>
-  <w:num w:numId="70" w16cid:durableId="12004544">
+  <w:num w:numId="70">
     <w:abstractNumId w:val="23"/>
   </w:num>
-  <w:num w:numId="71" w16cid:durableId="1283343127">
+  <w:num w:numId="71">
     <w:abstractNumId w:val="149"/>
   </w:num>
-  <w:num w:numId="72" w16cid:durableId="1866945179">
+  <w:num w:numId="72">
     <w:abstractNumId w:val="79"/>
   </w:num>
-  <w:num w:numId="73" w16cid:durableId="234702634">
+  <w:num w:numId="73">
     <w:abstractNumId w:val="11"/>
   </w:num>
-  <w:num w:numId="74" w16cid:durableId="671564209">
+  <w:num w:numId="74">
     <w:abstractNumId w:val="94"/>
   </w:num>
-  <w:num w:numId="75" w16cid:durableId="2137288263">
+  <w:num w:numId="75">
     <w:abstractNumId w:val="40"/>
   </w:num>
-  <w:num w:numId="76" w16cid:durableId="353770270">
+  <w:num w:numId="76">
     <w:abstractNumId w:val="58"/>
   </w:num>
-  <w:num w:numId="77" w16cid:durableId="1409108237">
+  <w:num w:numId="77">
     <w:abstractNumId w:val="14"/>
   </w:num>
-  <w:num w:numId="78" w16cid:durableId="1565991768">
+  <w:num w:numId="78">
     <w:abstractNumId w:val="16"/>
   </w:num>
-  <w:num w:numId="79" w16cid:durableId="633365219">
+  <w:num w:numId="79">
     <w:abstractNumId w:val="96"/>
   </w:num>
-  <w:num w:numId="80" w16cid:durableId="354423883">
+  <w:num w:numId="80">
     <w:abstractNumId w:val="70"/>
   </w:num>
-  <w:num w:numId="81" w16cid:durableId="1910336565">
+  <w:num w:numId="81">
     <w:abstractNumId w:val="120"/>
   </w:num>
-  <w:num w:numId="82" w16cid:durableId="1657299497">
+  <w:num w:numId="82">
     <w:abstractNumId w:val="53"/>
   </w:num>
-  <w:num w:numId="83" w16cid:durableId="1298561556">
+  <w:num w:numId="83">
     <w:abstractNumId w:val="133"/>
   </w:num>
-  <w:num w:numId="84" w16cid:durableId="1560168329">
+  <w:num w:numId="84">
     <w:abstractNumId w:val="106"/>
   </w:num>
-  <w:num w:numId="85" w16cid:durableId="2076588778">
+  <w:num w:numId="85">
     <w:abstractNumId w:val="98"/>
   </w:num>
-  <w:num w:numId="86" w16cid:durableId="356741613">
+  <w:num w:numId="86">
     <w:abstractNumId w:val="84"/>
   </w:num>
-  <w:num w:numId="87" w16cid:durableId="772747459">
+  <w:num w:numId="87">
     <w:abstractNumId w:val="128"/>
   </w:num>
-  <w:num w:numId="88" w16cid:durableId="1944603406">
+  <w:num w:numId="88">
     <w:abstractNumId w:val="9"/>
   </w:num>
-  <w:num w:numId="89" w16cid:durableId="506407976">
+  <w:num w:numId="89">
     <w:abstractNumId w:val="36"/>
   </w:num>
-  <w:num w:numId="90" w16cid:durableId="1324625844">
+  <w:num w:numId="90">
     <w:abstractNumId w:val="127"/>
   </w:num>
-  <w:num w:numId="91" w16cid:durableId="2141264545">
+  <w:num w:numId="91">
     <w:abstractNumId w:val="8"/>
   </w:num>
-  <w:num w:numId="92" w16cid:durableId="2168170">
+  <w:num w:numId="92">
     <w:abstractNumId w:val="64"/>
   </w:num>
-  <w:num w:numId="93" w16cid:durableId="1881623283">
+  <w:num w:numId="93">
     <w:abstractNumId w:val="30"/>
   </w:num>
-  <w:num w:numId="94" w16cid:durableId="1321077972">
+  <w:num w:numId="94">
     <w:abstractNumId w:val="17"/>
   </w:num>
-  <w:num w:numId="95" w16cid:durableId="1645115869">
+  <w:num w:numId="95">
     <w:abstractNumId w:val="97"/>
   </w:num>
-  <w:num w:numId="96" w16cid:durableId="1624188545">
+  <w:num w:numId="96">
     <w:abstractNumId w:val="123"/>
   </w:num>
-  <w:num w:numId="97" w16cid:durableId="1901744096">
+  <w:num w:numId="97">
     <w:abstractNumId w:val="135"/>
   </w:num>
-  <w:num w:numId="98" w16cid:durableId="177626479">
+  <w:num w:numId="98">
     <w:abstractNumId w:val="100"/>
   </w:num>
-  <w:num w:numId="99" w16cid:durableId="1766997359">
+  <w:num w:numId="99">
     <w:abstractNumId w:val="20"/>
   </w:num>
-  <w:num w:numId="100" w16cid:durableId="856771980">
+  <w:num w:numId="100">
     <w:abstractNumId w:val="146"/>
   </w:num>
-  <w:num w:numId="101" w16cid:durableId="1151751843">
+  <w:num w:numId="101">
     <w:abstractNumId w:val="21"/>
   </w:num>
-  <w:num w:numId="102" w16cid:durableId="1407921171">
+  <w:num w:numId="102">
     <w:abstractNumId w:val="38"/>
   </w:num>
-  <w:num w:numId="103" w16cid:durableId="740516991">
+  <w:num w:numId="103">
     <w:abstractNumId w:val="47"/>
   </w:num>
-  <w:num w:numId="104" w16cid:durableId="2084332539">
+  <w:num w:numId="104">
     <w:abstractNumId w:val="71"/>
   </w:num>
-  <w:num w:numId="105" w16cid:durableId="893541265">
+  <w:num w:numId="105">
     <w:abstractNumId w:val="108"/>
   </w:num>
-  <w:num w:numId="106" w16cid:durableId="2021466141">
+  <w:num w:numId="106">
     <w:abstractNumId w:val="26"/>
   </w:num>
-  <w:num w:numId="107" w16cid:durableId="1757046126">
+  <w:num w:numId="107">
     <w:abstractNumId w:val="87"/>
   </w:num>
-  <w:num w:numId="108" w16cid:durableId="1347516000">
+  <w:num w:numId="108">
     <w:abstractNumId w:val="124"/>
   </w:num>
-  <w:num w:numId="109" w16cid:durableId="1630742288">
+  <w:num w:numId="109">
     <w:abstractNumId w:val="6"/>
   </w:num>
-  <w:num w:numId="110" w16cid:durableId="1593203238">
+  <w:num w:numId="110">
     <w:abstractNumId w:val="129"/>
   </w:num>
-  <w:num w:numId="111" w16cid:durableId="1497648901">
+  <w:num w:numId="111">
     <w:abstractNumId w:val="109"/>
   </w:num>
-  <w:num w:numId="112" w16cid:durableId="308286733">
+  <w:num w:numId="112">
     <w:abstractNumId w:val="134"/>
   </w:num>
-  <w:num w:numId="113" w16cid:durableId="1190029306">
+  <w:num w:numId="113">
     <w:abstractNumId w:val="61"/>
   </w:num>
-  <w:num w:numId="114" w16cid:durableId="1970670575">
+  <w:num w:numId="114">
     <w:abstractNumId w:val="76"/>
   </w:num>
-  <w:num w:numId="115" w16cid:durableId="803500674">
+  <w:num w:numId="115">
     <w:abstractNumId w:val="81"/>
   </w:num>
-  <w:num w:numId="116" w16cid:durableId="947393148">
+  <w:num w:numId="116">
     <w:abstractNumId w:val="90"/>
   </w:num>
-  <w:num w:numId="117" w16cid:durableId="1382289327">
+  <w:num w:numId="117">
     <w:abstractNumId w:val="57"/>
   </w:num>
-  <w:num w:numId="118" w16cid:durableId="391081967">
+  <w:num w:numId="118">
     <w:abstractNumId w:val="46"/>
   </w:num>
-  <w:num w:numId="119" w16cid:durableId="713848972">
+  <w:num w:numId="119">
     <w:abstractNumId w:val="116"/>
   </w:num>
-  <w:num w:numId="120" w16cid:durableId="1821992373">
+  <w:num w:numId="120">
     <w:abstractNumId w:val="37"/>
   </w:num>
-  <w:num w:numId="121" w16cid:durableId="2025159180">
+  <w:num w:numId="121">
     <w:abstractNumId w:val="88"/>
   </w:num>
-  <w:num w:numId="122" w16cid:durableId="2133085475">
+  <w:num w:numId="122">
     <w:abstractNumId w:val="29"/>
   </w:num>
-  <w:num w:numId="123" w16cid:durableId="346493152">
+  <w:num w:numId="123">
     <w:abstractNumId w:val="34"/>
   </w:num>
-  <w:num w:numId="124" w16cid:durableId="991327791">
+  <w:num w:numId="124">
     <w:abstractNumId w:val="18"/>
   </w:num>
-  <w:num w:numId="125" w16cid:durableId="1150363013">
+  <w:num w:numId="125">
     <w:abstractNumId w:val="19"/>
   </w:num>
-  <w:num w:numId="126" w16cid:durableId="1032150662">
+  <w:num w:numId="126">
     <w:abstractNumId w:val="111"/>
   </w:num>
-  <w:num w:numId="127" w16cid:durableId="265039740">
+  <w:num w:numId="127">
     <w:abstractNumId w:val="107"/>
   </w:num>
-  <w:num w:numId="128" w16cid:durableId="1617977613">
+  <w:num w:numId="128">
     <w:abstractNumId w:val="131"/>
   </w:num>
-  <w:num w:numId="129" w16cid:durableId="166211796">
+  <w:num w:numId="129">
     <w:abstractNumId w:val="119"/>
   </w:num>
-  <w:num w:numId="130" w16cid:durableId="542907240">
+  <w:num w:numId="130">
     <w:abstractNumId w:val="5"/>
   </w:num>
-  <w:num w:numId="131" w16cid:durableId="448014945">
+  <w:num w:numId="131">
     <w:abstractNumId w:val="117"/>
   </w:num>
-  <w:num w:numId="132" w16cid:durableId="151064368">
+  <w:num w:numId="132">
     <w:abstractNumId w:val="48"/>
   </w:num>
-  <w:num w:numId="133" w16cid:durableId="1577089576">
+  <w:num w:numId="133">
     <w:abstractNumId w:val="49"/>
   </w:num>
-  <w:num w:numId="134" w16cid:durableId="659042181">
+  <w:num w:numId="134">
     <w:abstractNumId w:val="31"/>
   </w:num>
-  <w:num w:numId="135" w16cid:durableId="1248927627">
+  <w:num w:numId="135">
     <w:abstractNumId w:val="33"/>
   </w:num>
-  <w:num w:numId="136" w16cid:durableId="179859018">
+  <w:num w:numId="136">
     <w:abstractNumId w:val="52"/>
   </w:num>
-  <w:num w:numId="137" w16cid:durableId="1433545764">
+  <w:num w:numId="137">
     <w:abstractNumId w:val="41"/>
   </w:num>
-  <w:num w:numId="138" w16cid:durableId="1804883325">
+  <w:num w:numId="138">
     <w:abstractNumId w:val="35"/>
   </w:num>
-  <w:num w:numId="139" w16cid:durableId="373625443">
+  <w:num w:numId="139">
     <w:abstractNumId w:val="101"/>
   </w:num>
-  <w:num w:numId="140" w16cid:durableId="2030332073">
+  <w:num w:numId="140">
     <w:abstractNumId w:val="69"/>
   </w:num>
-  <w:num w:numId="141" w16cid:durableId="292638962">
+  <w:num w:numId="141">
     <w:abstractNumId w:val="110"/>
   </w:num>
-  <w:num w:numId="142" w16cid:durableId="1601134839">
+  <w:num w:numId="142">
     <w:abstractNumId w:val="142"/>
   </w:num>
-  <w:num w:numId="143" w16cid:durableId="1084646440">
+  <w:num w:numId="143">
     <w:abstractNumId w:val="65"/>
   </w:num>
-  <w:num w:numId="144" w16cid:durableId="1119640496">
+  <w:num w:numId="144">
     <w:abstractNumId w:val="122"/>
   </w:num>
-  <w:num w:numId="145" w16cid:durableId="439109505">
+  <w:num w:numId="145">
     <w:abstractNumId w:val="27"/>
   </w:num>
-  <w:num w:numId="146" w16cid:durableId="136067002">
+  <w:num w:numId="146">
     <w:abstractNumId w:val="44"/>
   </w:num>
-  <w:num w:numId="147" w16cid:durableId="415710786">
+  <w:num w:numId="147">
     <w:abstractNumId w:val="32"/>
   </w:num>
-  <w:num w:numId="148" w16cid:durableId="584801690">
+  <w:num w:numId="148">
     <w:abstractNumId w:val="99"/>
   </w:num>
-  <w:num w:numId="149" w16cid:durableId="453327539">
+  <w:num w:numId="149">
     <w:abstractNumId w:val="59"/>
   </w:num>
-  <w:num w:numId="150" w16cid:durableId="1243442538">
+  <w:num w:numId="150">
     <w:abstractNumId w:val="114"/>
   </w:num>
-  <w:num w:numId="151" w16cid:durableId="1294556463">
+  <w:num w:numId="151">
     <w:abstractNumId w:val="28"/>
   </w:num>
-  <w:num w:numId="152" w16cid:durableId="1734740535">
+  <w:num w:numId="152">
     <w:abstractNumId w:val="43"/>
   </w:num>
-  <w:num w:numId="153" w16cid:durableId="825584547">
+  <w:num w:numId="153">
     <w:abstractNumId w:val="93"/>
   </w:num>
   <w:numIdMacAtCleanup w:val="145"/>
@@ -37790,7 +37812,7 @@
 </file>
 
 <file path=word/styles.xml><?xml version="1.0" encoding="utf-8"?>
-<w:styles xmlns:mc="http://schemas.openxmlformats.org/markup-compatibility/2006" xmlns:r="http://schemas.openxmlformats.org/officeDocument/2006/relationships" xmlns:w="http://schemas.openxmlformats.org/wordprocessingml/2006/main" xmlns:w14="http://schemas.microsoft.com/office/word/2010/wordml" xmlns:w15="http://schemas.microsoft.com/office/word/2012/wordml" xmlns:w16cex="http://schemas.microsoft.com/office/word/2018/wordml/cex" xmlns:w16cid="http://schemas.microsoft.com/office/word/2016/wordml/cid" xmlns:w16="http://schemas.microsoft.com/office/word/2018/wordml" xmlns:w16du="http://schemas.microsoft.com/office/word/2023/wordml/word16du" xmlns:w16sdtdh="http://schemas.microsoft.com/office/word/2020/wordml/sdtdatahash" xmlns:w16se="http://schemas.microsoft.com/office/word/2015/wordml/symex" mc:Ignorable="w14 w15 w16se w16cid w16 w16cex w16sdtdh w16du">
+<w:styles xmlns:mc="http://schemas.openxmlformats.org/markup-compatibility/2006" xmlns:r="http://schemas.openxmlformats.org/officeDocument/2006/relationships" xmlns:w="http://schemas.openxmlformats.org/wordprocessingml/2006/main" xmlns:w14="http://schemas.microsoft.com/office/word/2010/wordml" xmlns:w15="http://schemas.microsoft.com/office/word/2012/wordml" xmlns:w16cid="http://schemas.microsoft.com/office/word/2016/wordml/cid" xmlns:w16se="http://schemas.microsoft.com/office/word/2015/wordml/symex" mc:Ignorable="w14 w15 w16se w16cid">
   <w:docDefaults>
     <w:rPrDefault>
       <w:rPr>
@@ -37806,7 +37828,7 @@
       </w:pPr>
     </w:pPrDefault>
   </w:docDefaults>
-  <w:latentStyles w:defLockedState="0" w:defUIPriority="99" w:defSemiHidden="0" w:defUnhideWhenUsed="0" w:defQFormat="0" w:count="376">
+  <w:latentStyles w:defLockedState="0" w:defUIPriority="99" w:defSemiHidden="0" w:defUnhideWhenUsed="0" w:defQFormat="0" w:count="375">
     <w:lsdException w:name="Normal" w:uiPriority="1" w:qFormat="1"/>
     <w:lsdException w:name="heading 1" w:uiPriority="1" w:qFormat="1"/>
     <w:lsdException w:name="heading 2" w:semiHidden="1" w:uiPriority="1" w:unhideWhenUsed="1" w:qFormat="1"/>
@@ -38182,7 +38204,6 @@
     <w:lsdException w:name="Smart Hyperlink" w:semiHidden="1" w:unhideWhenUsed="1"/>
     <w:lsdException w:name="Hashtag" w:semiHidden="1" w:unhideWhenUsed="1"/>
     <w:lsdException w:name="Unresolved Mention" w:semiHidden="1" w:unhideWhenUsed="1"/>
-    <w:lsdException w:name="Smart Link" w:semiHidden="1" w:unhideWhenUsed="1"/>
   </w:latentStyles>
   <w:style w:type="paragraph" w:default="1" w:styleId="Normal">
     <w:name w:val="Normal"/>
@@ -38978,7 +38999,7 @@
 </file>
 
 <file path=customXml/itemProps2.xml><?xml version="1.0" encoding="utf-8"?>
-<ds:datastoreItem xmlns:ds="http://schemas.openxmlformats.org/officeDocument/2006/customXml" ds:itemID="{CE29F0F3-46F4-41D4-BD92-037F3429E119}">
+<ds:datastoreItem xmlns:ds="http://schemas.openxmlformats.org/officeDocument/2006/customXml" ds:itemID="{1268FA83-AC7E-42AC-A64C-341B737D9F3A}">
   <ds:schemaRefs>
     <ds:schemaRef ds:uri="http://schemas.openxmlformats.org/officeDocument/2006/bibliography"/>
   </ds:schemaRefs>

</xml_diff>